<commit_message>
05: especificación sin tamaño, lectura D, 35 mecanismos con comparación frente al promedio previo, dosis-respuesta por quintiles de Kaitz y sensibilidad HonestDiD; traslape declarado como limitación
Co-Authored-By: Claude Sonnet 5 <noreply@anthropic.com>
</commit_message>
<xml_diff>
--- a/4. RESULTADOS/05_resultados_y_mecanismos/T03_evento_empleo.docx
+++ b/4. RESULTADOS/05_resultados_y_mecanismos/T03_evento_empleo.docx
@@ -488,7 +488,7 @@
                 <w:szCs w:val="22"/>
                 <w:color w:val="000000"/>
               </w:rPr>
-              <w:t xml:space="preserve">-0.0075</w:t>
+              <w:t xml:space="preserve">0.0686</w:t>
             </w:r>
           </w:p>
         </w:tc>
@@ -543,7 +543,7 @@
                 <w:szCs w:val="22"/>
                 <w:color w:val="000000"/>
               </w:rPr>
-              <w:t xml:space="preserve">0.0117</w:t>
+              <w:t xml:space="preserve">0.0113</w:t>
             </w:r>
           </w:p>
         </w:tc>
@@ -598,7 +598,7 @@
                 <w:szCs w:val="22"/>
                 <w:color w:val="000000"/>
               </w:rPr>
-              <w:t xml:space="preserve">0.5178</w:t>
+              <w:t xml:space="preserve">0.0000</w:t>
             </w:r>
           </w:p>
         </w:tc>
@@ -653,7 +653,7 @@
                 <w:szCs w:val="22"/>
                 <w:color w:val="000000"/>
               </w:rPr>
-              <w:t xml:space="preserve">-0.7537</w:t>
+              <w:t xml:space="preserve">6.8609</w:t>
             </w:r>
           </w:p>
         </w:tc>
@@ -708,7 +708,7 @@
                 <w:szCs w:val="22"/>
                 <w:color w:val="000000"/>
               </w:rPr>
-              <w:t xml:space="preserve"/>
+              <w:t xml:space="preserve">***</w:t>
             </w:r>
           </w:p>
         </w:tc>
@@ -823,7 +823,7 @@
                 <w:szCs w:val="22"/>
                 <w:color w:val="000000"/>
               </w:rPr>
-              <w:t xml:space="preserve">-0.0079</w:t>
+              <w:t xml:space="preserve">0.0623</w:t>
             </w:r>
           </w:p>
         </w:tc>
@@ -878,7 +878,7 @@
                 <w:szCs w:val="22"/>
                 <w:color w:val="000000"/>
               </w:rPr>
-              <w:t xml:space="preserve">0.0110</w:t>
+              <w:t xml:space="preserve">0.0106</w:t>
             </w:r>
           </w:p>
         </w:tc>
@@ -933,7 +933,7 @@
                 <w:szCs w:val="22"/>
                 <w:color w:val="000000"/>
               </w:rPr>
-              <w:t xml:space="preserve">0.4701</w:t>
+              <w:t xml:space="preserve">0.0000</w:t>
             </w:r>
           </w:p>
         </w:tc>
@@ -988,7 +988,7 @@
                 <w:szCs w:val="22"/>
                 <w:color w:val="000000"/>
               </w:rPr>
-              <w:t xml:space="preserve">-0.7946</w:t>
+              <w:t xml:space="preserve">6.2254</w:t>
             </w:r>
           </w:p>
         </w:tc>
@@ -1043,7 +1043,7 @@
                 <w:szCs w:val="22"/>
                 <w:color w:val="000000"/>
               </w:rPr>
-              <w:t xml:space="preserve"/>
+              <w:t xml:space="preserve">***</w:t>
             </w:r>
           </w:p>
         </w:tc>
@@ -1158,7 +1158,7 @@
                 <w:szCs w:val="22"/>
                 <w:color w:val="000000"/>
               </w:rPr>
-              <w:t xml:space="preserve">-0.0105</w:t>
+              <w:t xml:space="preserve">0.0560</w:t>
             </w:r>
           </w:p>
         </w:tc>
@@ -1213,7 +1213,7 @@
                 <w:szCs w:val="22"/>
                 <w:color w:val="000000"/>
               </w:rPr>
-              <w:t xml:space="preserve">0.0102</w:t>
+              <w:t xml:space="preserve">0.0099</w:t>
             </w:r>
           </w:p>
         </w:tc>
@@ -1268,7 +1268,7 @@
                 <w:szCs w:val="22"/>
                 <w:color w:val="000000"/>
               </w:rPr>
-              <w:t xml:space="preserve">0.3076</w:t>
+              <w:t xml:space="preserve">0.0000</w:t>
             </w:r>
           </w:p>
         </w:tc>
@@ -1323,7 +1323,7 @@
                 <w:szCs w:val="22"/>
                 <w:color w:val="000000"/>
               </w:rPr>
-              <w:t xml:space="preserve">-1.0453</w:t>
+              <w:t xml:space="preserve">5.5991</w:t>
             </w:r>
           </w:p>
         </w:tc>
@@ -1378,7 +1378,7 @@
                 <w:szCs w:val="22"/>
                 <w:color w:val="000000"/>
               </w:rPr>
-              <w:t xml:space="preserve"/>
+              <w:t xml:space="preserve">***</w:t>
             </w:r>
           </w:p>
         </w:tc>
@@ -1493,7 +1493,7 @@
                 <w:szCs w:val="22"/>
                 <w:color w:val="000000"/>
               </w:rPr>
-              <w:t xml:space="preserve">-0.0149</w:t>
+              <w:t xml:space="preserve">0.0394</w:t>
             </w:r>
           </w:p>
         </w:tc>
@@ -1548,7 +1548,7 @@
                 <w:szCs w:val="22"/>
                 <w:color w:val="000000"/>
               </w:rPr>
-              <w:t xml:space="preserve">0.0092</w:t>
+              <w:t xml:space="preserve">0.0086</w:t>
             </w:r>
           </w:p>
         </w:tc>
@@ -1603,7 +1603,7 @@
                 <w:szCs w:val="22"/>
                 <w:color w:val="000000"/>
               </w:rPr>
-              <w:t xml:space="preserve">0.1031</w:t>
+              <w:t xml:space="preserve">0.0000</w:t>
             </w:r>
           </w:p>
         </w:tc>
@@ -1658,7 +1658,7 @@
                 <w:szCs w:val="22"/>
                 <w:color w:val="000000"/>
               </w:rPr>
-              <w:t xml:space="preserve">-1.4920</w:t>
+              <w:t xml:space="preserve">3.9386</w:t>
             </w:r>
           </w:p>
         </w:tc>
@@ -1713,7 +1713,7 @@
                 <w:szCs w:val="22"/>
                 <w:color w:val="000000"/>
               </w:rPr>
-              <w:t xml:space="preserve"/>
+              <w:t xml:space="preserve">***</w:t>
             </w:r>
           </w:p>
         </w:tc>
@@ -1828,7 +1828,7 @@
                 <w:szCs w:val="22"/>
                 <w:color w:val="000000"/>
               </w:rPr>
-              <w:t xml:space="preserve">-0.0176</w:t>
+              <w:t xml:space="preserve">0.0261</w:t>
             </w:r>
           </w:p>
         </w:tc>
@@ -1883,7 +1883,7 @@
                 <w:szCs w:val="22"/>
                 <w:color w:val="000000"/>
               </w:rPr>
-              <w:t xml:space="preserve">0.0080</w:t>
+              <w:t xml:space="preserve">0.0076</w:t>
             </w:r>
           </w:p>
         </w:tc>
@@ -1938,7 +1938,7 @@
                 <w:szCs w:val="22"/>
                 <w:color w:val="000000"/>
               </w:rPr>
-              <w:t xml:space="preserve">0.0269</w:t>
+              <w:t xml:space="preserve">0.0006</w:t>
             </w:r>
           </w:p>
         </w:tc>
@@ -1993,7 +1993,7 @@
                 <w:szCs w:val="22"/>
                 <w:color w:val="000000"/>
               </w:rPr>
-              <w:t xml:space="preserve">-1.7626</w:t>
+              <w:t xml:space="preserve">2.6052</w:t>
             </w:r>
           </w:p>
         </w:tc>
@@ -2048,7 +2048,7 @@
                 <w:szCs w:val="22"/>
                 <w:color w:val="000000"/>
               </w:rPr>
-              <w:t xml:space="preserve">**</w:t>
+              <w:t xml:space="preserve">***</w:t>
             </w:r>
           </w:p>
         </w:tc>
@@ -2163,7 +2163,7 @@
                 <w:szCs w:val="22"/>
                 <w:color w:val="000000"/>
               </w:rPr>
-              <w:t xml:space="preserve">-0.0078</w:t>
+              <w:t xml:space="preserve">0.0122</w:t>
             </w:r>
           </w:p>
         </w:tc>
@@ -2218,7 +2218,7 @@
                 <w:szCs w:val="22"/>
                 <w:color w:val="000000"/>
               </w:rPr>
-              <w:t xml:space="preserve">0.0056</w:t>
+              <w:t xml:space="preserve">0.0053</w:t>
             </w:r>
           </w:p>
         </w:tc>
@@ -2273,7 +2273,7 @@
                 <w:szCs w:val="22"/>
                 <w:color w:val="000000"/>
               </w:rPr>
-              <w:t xml:space="preserve">0.1605</w:t>
+              <w:t xml:space="preserve">0.0217</w:t>
             </w:r>
           </w:p>
         </w:tc>
@@ -2328,7 +2328,7 @@
                 <w:szCs w:val="22"/>
                 <w:color w:val="000000"/>
               </w:rPr>
-              <w:t xml:space="preserve">-0.7819</w:t>
+              <w:t xml:space="preserve">1.2174</w:t>
             </w:r>
           </w:p>
         </w:tc>
@@ -2383,7 +2383,7 @@
                 <w:szCs w:val="22"/>
                 <w:color w:val="000000"/>
               </w:rPr>
-              <w:t xml:space="preserve"/>
+              <w:t xml:space="preserve">**</w:t>
             </w:r>
           </w:p>
         </w:tc>
@@ -2833,7 +2833,7 @@
                 <w:szCs w:val="22"/>
                 <w:color w:val="000000"/>
               </w:rPr>
-              <w:t xml:space="preserve">-0.0175</w:t>
+              <w:t xml:space="preserve">-0.0077</w:t>
             </w:r>
           </w:p>
         </w:tc>
@@ -2888,7 +2888,7 @@
                 <w:szCs w:val="22"/>
                 <w:color w:val="000000"/>
               </w:rPr>
-              <w:t xml:space="preserve">0.0061</w:t>
+              <w:t xml:space="preserve">0.0058</w:t>
             </w:r>
           </w:p>
         </w:tc>
@@ -2943,7 +2943,7 @@
                 <w:szCs w:val="22"/>
                 <w:color w:val="000000"/>
               </w:rPr>
-              <w:t xml:space="preserve">0.0039</w:t>
+              <w:t xml:space="preserve">0.1837</w:t>
             </w:r>
           </w:p>
         </w:tc>
@@ -2998,7 +2998,7 @@
                 <w:szCs w:val="22"/>
                 <w:color w:val="000000"/>
               </w:rPr>
-              <w:t xml:space="preserve">-1.7536</w:t>
+              <w:t xml:space="preserve">-0.7659</w:t>
             </w:r>
           </w:p>
         </w:tc>
@@ -3053,7 +3053,7 @@
                 <w:szCs w:val="22"/>
                 <w:color w:val="000000"/>
               </w:rPr>
-              <w:t xml:space="preserve">***</w:t>
+              <w:t xml:space="preserve"/>
             </w:r>
           </w:p>
         </w:tc>
@@ -3168,7 +3168,7 @@
                 <w:szCs w:val="22"/>
                 <w:color w:val="000000"/>
               </w:rPr>
-              <w:t xml:space="preserve">-0.0207</w:t>
+              <w:t xml:space="preserve">-0.0045</w:t>
             </w:r>
           </w:p>
         </w:tc>
@@ -3223,7 +3223,7 @@
                 <w:szCs w:val="22"/>
                 <w:color w:val="000000"/>
               </w:rPr>
-              <w:t xml:space="preserve">0.0078</w:t>
+              <w:t xml:space="preserve">0.0073</w:t>
             </w:r>
           </w:p>
         </w:tc>
@@ -3278,7 +3278,7 @@
                 <w:szCs w:val="22"/>
                 <w:color w:val="000000"/>
               </w:rPr>
-              <w:t xml:space="preserve">0.0080</w:t>
+              <w:t xml:space="preserve">0.5380</w:t>
             </w:r>
           </w:p>
         </w:tc>
@@ -3333,7 +3333,7 @@
                 <w:szCs w:val="22"/>
                 <w:color w:val="000000"/>
               </w:rPr>
-              <w:t xml:space="preserve">-2.0733</w:t>
+              <w:t xml:space="preserve">-0.4510</w:t>
             </w:r>
           </w:p>
         </w:tc>
@@ -3388,7 +3388,7 @@
                 <w:szCs w:val="22"/>
                 <w:color w:val="000000"/>
               </w:rPr>
-              <w:t xml:space="preserve">***</w:t>
+              <w:t xml:space="preserve"/>
             </w:r>
           </w:p>
         </w:tc>

</xml_diff>